<commit_message>
Recommend developing the per-emotion guidance with clinicians
The three universal rules the generator follows come from published
counselling sources, but the per-emotion guidance - what makes a reply
to a lonely message differ from a reply to a furious one - was written
by us, and it is the one part of the system with no external grounding.

Sections 5.6.6 and 6.4 now recommend developing it with practising
counsellors and clinical psychologists: interviewing them on how they
answer each kind of situation, having them rewrite the 32 sets of
instructions, and comparing the result with ours. The guidance is read
at generation time, so replacing it retrains neither model. The matching
limitation is now stated in 5.6.5 and 6.3, which count eight rather than
seven.

Also repairs a paragraph in 5.6.1 that an earlier edit had left split
across five lines with stray quotation marks, which were printing in the
document.

Co-Authored-By: Claude Opus 5 (1M context) <noreply@anthropic.com>
</commit_message>
<xml_diff>
--- a/final writing/Chapter_5_Results_and_Analysis.docx
+++ b/final writing/Chapter_5_Results_and_Analysis.docx
@@ -8094,7 +8094,15 @@
         <w:spacing w:after="120"/>
       </w:pPr>
       <w:r>
-        <w:t>The empathy and fidelity gains come from the structure and not from the size of the generator, which is "</w:t>
+        <w:t>The empathy and fidelity gains come from the structure and not from the size of the generator, which is what the middle column establishes: the same generator alone scores 4.75 and 27.0%, and gains nothing on either measure over the 1.5-billion-parameter single model (Section 5.5.5). The bigger single model remains ahead on rules and on the empathy classifier, though the judges separate neither its empathy nor its overall score from ours after correction. The case for decoupling is therefore not that separation beats scale, but that separation produces an emotional decision that is written down, at a size that fits the hardware most people have.</w:t>
+      </w:r>
+    </w:p>
+    <w:p>
+      <w:pPr>
+        <w:pStyle w:val="Heading2"/>
+      </w:pPr>
+      <w:r>
+        <w:t>5.6.2 Why the Two-Stage Design Works</w:t>
       </w:r>
     </w:p>
     <w:p>
@@ -8102,7 +8110,16 @@
         <w:spacing w:after="120"/>
       </w:pPr>
       <w:r>
-        <w:t>what the middle column establishes: the same generator alone scores 4.75 and 27.0%, and gains nothing on "</w:t>
+        <w:t xml:space="preserve">The most surprising result in the chapter is that the stage-1 choice agrees with the dataset's label </w:t>
+      </w:r>
+      <w:r>
+        <w:rPr>
+          <w:i/>
+        </w:rPr>
+        <w:t>less</w:t>
+      </w:r>
+      <w:r>
+        <w:t xml:space="preserve"> often than the detector's own top prediction (42.3% against 50.3%), while the system built on it has the best emotion fidelity and the strongest empathy scores of any comparable design. Three observations reconcile this.</w:t>
       </w:r>
     </w:p>
     <w:p>
@@ -8110,7 +8127,25 @@
         <w:spacing w:after="120"/>
       </w:pPr>
       <w:r>
-        <w:t>either measure over the 1.5-billion-parameter single model (Section 5.5.5). The bigger single model remains "</w:t>
+        <w:t xml:space="preserve">First, EmpatheticDialogues gives each conversation one fine-grained label chosen by the speaker before they wrote anything, and many messages plausibly express a neighbouring feeling; since almost all disagreements are between neighbours, a choice that differs from the label is often still a fair reading of the text. Second, replies built on a wrong label are no worse than replies built on a right one (Section 5.4.3): what a reply needs is a feeling close enough to answer, not the exact gold label. Third, the improvement appears when per-emotion guidance is added. Telling the generator </w:t>
+      </w:r>
+      <w:r>
+        <w:rPr>
+          <w:i/>
+        </w:rPr>
+        <w:t>how</w:t>
+      </w:r>
+      <w:r>
+        <w:t xml:space="preserve"> to answer loneliness, rather than only </w:t>
+      </w:r>
+      <w:r>
+        <w:rPr>
+          <w:i/>
+        </w:rPr>
+        <w:t>that</w:t>
+      </w:r>
+      <w:r>
+        <w:t xml:space="preserve"> the person is lonely, changes what the reply says.</w:t>
       </w:r>
     </w:p>
     <w:p>
@@ -8118,7 +8153,15 @@
         <w:spacing w:after="120"/>
       </w:pPr>
       <w:r>
-        <w:t>ahead on rules and on the empathy classifier, though the judges separate neither its empathy nor its overall "</w:t>
+        <w:t>Because our comparison removed the selection, the guidance and the cue words together, their individual shares cannot be separated, and the accuracy result above suggests the guidance carries most of the weight. This is also a narrower effect than the design's advantage over single models: the judges rate the two-stage and top-1 configurations almost identically, so the benefit shows up in the finer measures of empathy and emotional fidelity rather than in overall ratings.</w:t>
+      </w:r>
+    </w:p>
+    <w:p>
+      <w:pPr>
+        <w:pStyle w:val="Heading2"/>
+      </w:pPr>
+      <w:r>
+        <w:t>5.6.3 Objections, and When a Single Model Is the Better Choice</w:t>
       </w:r>
     </w:p>
     <w:p>
@@ -8126,7 +8169,25 @@
         <w:spacing w:after="120"/>
       </w:pPr>
       <w:r>
-        <w:t>score from ours after correction. The case for decoupling is therefore not that separation beats scale. It is "</w:t>
+        <w:t xml:space="preserve">Two objections can be made to this design, and both were tested rather than argued. </w:t>
+      </w:r>
+      <w:r>
+        <w:rPr>
+          <w:b/>
+        </w:rPr>
+        <w:t>That a second model is unnecessary:</w:t>
+      </w:r>
+      <w:r>
+        <w:t xml:space="preserve"> a single model of the same size, and our own generator used the same way, both produced less empathetic and less emotionally faithful replies; the detector costs 125 million parameters and under ten minutes of training, and a larger one changed nothing. </w:t>
+      </w:r>
+      <w:r>
+        <w:rPr>
+          <w:b/>
+        </w:rPr>
+        <w:t>That retrieval would do the job more simply:</w:t>
+      </w:r>
+      <w:r>
+        <w:t xml:space="preserve"> showing the generator real conversations with the same emotion [40] cut rule adherence in both versions we built, because real listener replies seldom follow the rules themselves. We did not build the full agentic system that was suggested to us, so this evidence concerns retrieval-augmented prompting and not agentic designs in general.</w:t>
       </w:r>
     </w:p>
     <w:p>
@@ -8134,7 +8195,15 @@
         <w:spacing w:after="120"/>
       </w:pPr>
       <w:r>
-        <w:t>that separation produces an emotional decision that is written down, at a size that fits the hardware most "</w:t>
+        <w:t>There is also a case against our own design. If the only goal is the best reply, on hardware that can hold a 7-billion-parameter model, our results favour the larger single model. Decoupling is the better choice when the emotional reasoning has to be visible: to audit why a reply took a particular tone, to show a user or a clinician which emotion was read, or to place a safeguard before any text is generated. The two are not exclusive, and combining the detector and per-emotion prompting with a larger generator is the obvious next experiment.</w:t>
+      </w:r>
+    </w:p>
+    <w:p>
+      <w:pPr>
+        <w:pStyle w:val="Heading2"/>
+      </w:pPr>
+      <w:r>
+        <w:t>5.6.4 Built to Be Used</w:t>
       </w:r>
     </w:p>
     <w:p>
@@ -8142,7 +8211,43 @@
         <w:spacing w:after="120"/>
       </w:pPr>
       <w:r>
-        <w:t>people have.</w:t>
+        <w:t xml:space="preserve">The thesis calls this design application-oriented, and the word has to earn its place: a benchmark entry becomes a usable system only if someone can run it, talk to it, see what it decided and change what it does. Four properties, each measured rather than asserted, are what make the claim. </w:t>
+      </w:r>
+      <w:r>
+        <w:rPr>
+          <w:b/>
+        </w:rPr>
+        <w:t>It runs locally</w:t>
+      </w:r>
+      <w:r>
+        <w:t xml:space="preserve">, within 8 GB, so a deployed instance need not send anyone's disclosure to an external service. </w:t>
+      </w:r>
+      <w:r>
+        <w:rPr>
+          <w:b/>
+        </w:rPr>
+        <w:t>It holds a conversation</w:t>
+      </w:r>
+      <w:r>
+        <w:t xml:space="preserve">, reading the last four user turns, keeping ten exchanges of memory, and relaxing the question rule after the first turn so the exchange does not become an interrogation. </w:t>
+      </w:r>
+      <w:r>
+        <w:rPr>
+          <w:b/>
+        </w:rPr>
+        <w:t>It shows its work</w:t>
+      </w:r>
+      <w:r>
+        <w:t xml:space="preserve">: every turn exposes the three candidate emotions with their confidence, the emotion chosen, the words that drove the detection and any change of emotion, which an end-to-end model cannot offer. </w:t>
+      </w:r>
+      <w:r>
+        <w:rPr>
+          <w:b/>
+        </w:rPr>
+        <w:t>Its behaviour is controllable and replaceable</w:t>
+      </w:r>
+      <w:r>
+        <w:t>: replies stay short and ask exactly one question in 92.7% of first turns, and the detector, the guidance and the generator can each be swapped out on their own. None of these four is available from an end-to-end model of any size: it can produce the same reply, but not the emotion it answered, not a place to put a safeguard, and not a part that can be replaced on its own. Together they make the design a plausible first-line listener, for example in a student well-being service, once the limitations below are addressed.</w:t>
       </w:r>
     </w:p>
     <w:p>
@@ -8150,7 +8255,7 @@
         <w:pStyle w:val="Heading2"/>
       </w:pPr>
       <w:r>
-        <w:t>5.6.2 Why the Two-Stage Design Works</w:t>
+        <w:t>5.6.5 Limitations</w:t>
       </w:r>
     </w:p>
     <w:p>
@@ -8158,16 +8263,97 @@
         <w:spacing w:after="120"/>
       </w:pPr>
       <w:r>
-        <w:t xml:space="preserve">The most surprising result in the chapter is that the stage-1 choice agrees with the dataset's label </w:t>
+        <w:t xml:space="preserve">Eight limitations bound what this work can claim. </w:t>
       </w:r>
       <w:r>
         <w:rPr>
-          <w:i/>
+          <w:b/>
         </w:rPr>
-        <w:t>less</w:t>
-      </w:r>
-      <w:r>
-        <w:t xml:space="preserve"> often than the detector's own top prediction (42.3% against 50.3%), while the system built on it has the best emotion fidelity and the strongest empathy scores of any comparable design. Three observations reconcile this.</w:t>
+        <w:t>Data:</w:t>
+      </w:r>
+      <w:r>
+        <w:t xml:space="preserve"> EmpatheticDialogues is English, crowd-sourced and single-labelled, so neither the detection accuracy nor the suitability of the replies can be assumed to carry over to Bangla speakers or to people in real distress. </w:t>
+      </w:r>
+      <w:r>
+        <w:rPr>
+          <w:b/>
+        </w:rPr>
+        <w:t>Safety:</w:t>
+      </w:r>
+      <w:r>
+        <w:t xml:space="preserve"> the label set has no category for suicidal ideation and the system has no crisis safeguard beyond interface disclaimers. </w:t>
+      </w:r>
+      <w:r>
+        <w:rPr>
+          <w:b/>
+        </w:rPr>
+        <w:t>Measures:</w:t>
+      </w:r>
+      <w:r>
+        <w:t xml:space="preserve"> all the automatic measures are proxies; the acknowledgement check is keyword-based, the one-question rule is not rewarded by either empathy measure, the classifier was trained on a different domain and rewards length, emotion fidelity depends on our own detector, and the judge panel has only two members. </w:t>
+      </w:r>
+      <w:r>
+        <w:rPr>
+          <w:b/>
+        </w:rPr>
+        <w:t>Scale of evidence:</w:t>
+      </w:r>
+      <w:r>
+        <w:t xml:space="preserve"> 300 conversations for generation, 64 for the judges, and a small human study </w:t>
+      </w:r>
+      <w:r>
+        <w:rPr>
+          <w:b/>
+          <w:color w:val="B03A00"/>
+        </w:rPr>
+        <w:t>[[PENDING: final number of participants]]</w:t>
+      </w:r>
+      <w:r>
+        <w:t xml:space="preserve">. </w:t>
+      </w:r>
+      <w:r>
+        <w:rPr>
+          <w:b/>
+        </w:rPr>
+        <w:t>Guidance:</w:t>
+      </w:r>
+      <w:r>
+        <w:t xml:space="preserve"> the per-emotion instructions that shape every reply were written by the authors rather than by clinicians, and have had no professional review. </w:t>
+      </w:r>
+      <w:r>
+        <w:rPr>
+          <w:b/>
+        </w:rPr>
+        <w:t>Single turns:</w:t>
+      </w:r>
+      <w:r>
+        <w:t xml:space="preserve"> the quantitative results all concern first replies; the multi-turn agent was checked only on scenarios. </w:t>
+      </w:r>
+      <w:r>
+        <w:rPr>
+          <w:b/>
+        </w:rPr>
+        <w:t>Repetition:</w:t>
+      </w:r>
+      <w:r>
+        <w:t xml:space="preserve"> 58.7% of replies still reuse stock phrases. </w:t>
+      </w:r>
+      <w:r>
+        <w:rPr>
+          <w:b/>
+        </w:rPr>
+        <w:t>Efficiency:</w:t>
+      </w:r>
+      <w:r>
+        <w:t xml:space="preserve"> memory and time were measured on one GPU over 50 messages.</w:t>
+      </w:r>
+    </w:p>
+    <w:p>
+      <w:pPr>
+        <w:pStyle w:val="Heading2"/>
+      </w:pPr>
+      <w:r>
+        <w:t>5.6.6 Future Work</w:t>
       </w:r>
     </w:p>
     <w:p>
@@ -8175,25 +8361,7 @@
         <w:spacing w:after="120"/>
       </w:pPr>
       <w:r>
-        <w:t xml:space="preserve">First, EmpatheticDialogues gives each conversation one fine-grained label chosen by the speaker before they wrote anything, and many messages plausibly express a neighbouring feeling; since almost all disagreements are between neighbours, a choice that differs from the label is often still a fair reading of the text. Second, replies built on a wrong label are no worse than replies built on a right one (Section 5.4.3): what a reply needs is a feeling close enough to answer, not the exact gold label. Third, the improvement appears when per-emotion guidance is added. Telling the generator </w:t>
-      </w:r>
-      <w:r>
-        <w:rPr>
-          <w:i/>
-        </w:rPr>
-        <w:t>how</w:t>
-      </w:r>
-      <w:r>
-        <w:t xml:space="preserve"> to answer loneliness, rather than only </w:t>
-      </w:r>
-      <w:r>
-        <w:rPr>
-          <w:i/>
-        </w:rPr>
-        <w:t>that</w:t>
-      </w:r>
-      <w:r>
-        <w:t xml:space="preserve"> the person is lonely, changes what the reply says.</w:t>
+        <w:t>In order of priority: add a pre-generation crisis filter with reviewed safe responses, required before any public deployment [52]; run a component-wise ablation separating emotion selection, per-emotion guidance and attention cues; and combine the detector and per-emotion prompting with a larger generator.</w:t>
       </w:r>
     </w:p>
     <w:p>
@@ -8201,15 +8369,31 @@
         <w:spacing w:after="120"/>
       </w:pPr>
       <w:r>
-        <w:t>Because our comparison removed the selection, the guidance and the cue words together, their individual shares cannot be separated, and the accuracy result above suggests the guidance carries most of the weight. This is also a narrower effect than the design's advantage over single models: the judges rate the two-stage and top-1 configurations almost identically, so the benefit shows up in the finer measures of empathy and emotional fidelity rather than in overall ratings.</w:t>
-      </w:r>
-    </w:p>
-    <w:p>
-      <w:pPr>
-        <w:pStyle w:val="Heading2"/>
-      </w:pPr>
-      <w:r>
-        <w:t>5.6.3 Objections, and When a Single Model Is the Better Choice</w:t>
+        <w:rPr>
+          <w:b/>
+        </w:rPr>
+        <w:t>Guidance written with practitioners:</w:t>
+      </w:r>
+      <w:r>
+        <w:t xml:space="preserve"> The three universal rules come from published sources [2], [3], but the per-emotion guidance does not: the instructions telling the model how a </w:t>
+      </w:r>
+      <w:r>
+        <w:rPr>
+          <w:i/>
+        </w:rPr>
+        <w:t>lonely</w:t>
+      </w:r>
+      <w:r>
+        <w:t xml:space="preserve"> message differs from a </w:t>
+      </w:r>
+      <w:r>
+        <w:rPr>
+          <w:i/>
+        </w:rPr>
+        <w:t>furious</w:t>
+      </w:r>
+      <w:r>
+        <w:t xml:space="preserve"> one were written by the authors, who are not clinicians, and this is the one component with no external grounding. It should be developed with practising counsellors and clinical psychologists, by interviewing them about how they respond to each kind of situation, asking them to rewrite the 32 sets of instructions, and recording where their practice disagrees with ours; such interviews concern professional practice, not any patient's records. Published work already judges these systems against counselling criteria and against clinicians themselves [14], [24], so the standard exists and our guidance has not been held to it. The change is cheap, since the guidance is read at generation time and replacing it retrains nothing.</w:t>
       </w:r>
     </w:p>
     <w:p>
@@ -8217,25 +8401,13 @@
         <w:spacing w:after="120"/>
       </w:pPr>
       <w:r>
-        <w:t xml:space="preserve">Two objections can be made to this design, and both were tested rather than argued. </w:t>
-      </w:r>
-      <w:r>
         <w:rPr>
           <w:b/>
         </w:rPr>
-        <w:t>That a second model is unnecessary:</w:t>
-      </w:r>
-      <w:r>
-        <w:t xml:space="preserve"> a single model of the same size, and our own generator used the same way, both produced less empathetic and less emotionally faithful replies; the detector costs 125 million parameters and under ten minutes of training, and a larger one would not change the conclusion. </w:t>
-      </w:r>
-      <w:r>
-        <w:rPr>
-          <w:b/>
-        </w:rPr>
-        <w:t>That retrieval would do the job more simply:</w:t>
-      </w:r>
-      <w:r>
-        <w:t xml:space="preserve"> showing the generator real conversations with the same emotion [40] cut rule adherence in both versions we built, because real listener replies seldom follow the rules themselves. We did not build the full agentic system that was suggested to us, so this evidence concerns retrieval-augmented prompting and not agentic designs in general.</w:t>
+        <w:t>Beyond English:</w:t>
+      </w:r>
+      <w:r>
+        <w:t xml:space="preserve"> Everything here is English, because the corpus is and both models were pre-trained mostly on English text, so none of it should be assumed to hold for someone writing in another language. Extending it takes three steps: collect or adapt labelled emotional conversations in Bangla, including the code-mixed Bangla-English people here actually type; retrain the detector from a multilingual encoder, which is cheap at 125 million parameters; and rewrite the per-emotion guidance with speakers of the language, since how loneliness or shame should be answered is not the same everywhere and a translated prompt would carry English assumptions with it. The decoupled structure helps: a new language needs a new detector and new guidance, not a new generator.</w:t>
       </w:r>
     </w:p>
     <w:p>
@@ -8243,186 +8415,7 @@
         <w:spacing w:after="120"/>
       </w:pPr>
       <w:r>
-        <w:t>There is also a case against our own design. If the only goal is the best reply, on hardware that can hold a 7-billion-parameter model, our results favour the larger single model. Decoupling is the better choice when the emotional reasoning has to be visible: to audit why a reply took a particular tone, to show a user or a clinician which emotion was read, or to place a safeguard before any text is generated, and when components must be replaceable one at a time. The two are not exclusive, and combining the detector and per-emotion prompting with a larger generator is the most obvious next experiment.</w:t>
-      </w:r>
-    </w:p>
-    <w:p>
-      <w:pPr>
-        <w:pStyle w:val="Heading2"/>
-      </w:pPr>
-      <w:r>
-        <w:t>5.6.4 Built to Be Used</w:t>
-      </w:r>
-    </w:p>
-    <w:p>
-      <w:pPr>
-        <w:spacing w:after="120"/>
-      </w:pPr>
-      <w:r>
-        <w:t xml:space="preserve">The thesis calls this design application-oriented, and the word has to earn its place: a benchmark entry becomes a usable system only if someone can run it, talk to it, see what it decided and change what it does. Four properties, each measured rather than asserted, are what make the claim. </w:t>
-      </w:r>
-      <w:r>
-        <w:rPr>
-          <w:b/>
-        </w:rPr>
-        <w:t>It runs locally</w:t>
-      </w:r>
-      <w:r>
-        <w:t xml:space="preserve">, within 8 GB, so a deployed instance need not send anyone's disclosure to an external service. </w:t>
-      </w:r>
-      <w:r>
-        <w:rPr>
-          <w:b/>
-        </w:rPr>
-        <w:t>It holds a conversation</w:t>
-      </w:r>
-      <w:r>
-        <w:t xml:space="preserve">, reading the last four user turns, keeping ten exchanges of memory, and relaxing the question rule after the first turn so the exchange does not become an interrogation. </w:t>
-      </w:r>
-      <w:r>
-        <w:rPr>
-          <w:b/>
-        </w:rPr>
-        <w:t>It shows its work</w:t>
-      </w:r>
-      <w:r>
-        <w:t xml:space="preserve">: every turn exposes the three candidate emotions with their confidence, the emotion chosen, the words that drove the detection and any change of emotion, which an end-to-end model cannot offer. </w:t>
-      </w:r>
-      <w:r>
-        <w:rPr>
-          <w:b/>
-        </w:rPr>
-        <w:t>Its behaviour is controllable and replaceable</w:t>
-      </w:r>
-      <w:r>
-        <w:t>: replies stay short and ask exactly one question in 92.7% of first turns, and the detector, the guidance and the generator can each be swapped out on their own. None of these four is available from an end-to-end model of any size: it can produce the same reply, but not the emotion it answered, not a place to put a safeguard, and not a part that can be replaced on its own. Together they make the design a plausible first-line listener, for example in a student well-being service, once the limitations below are addressed.</w:t>
-      </w:r>
-    </w:p>
-    <w:p>
-      <w:pPr>
-        <w:pStyle w:val="Heading2"/>
-      </w:pPr>
-      <w:r>
-        <w:t>5.6.5 Limitations</w:t>
-      </w:r>
-    </w:p>
-    <w:p>
-      <w:pPr>
-        <w:spacing w:after="120"/>
-      </w:pPr>
-      <w:r>
-        <w:t xml:space="preserve">Seven limitations bound what this work can claim. </w:t>
-      </w:r>
-      <w:r>
-        <w:rPr>
-          <w:b/>
-        </w:rPr>
-        <w:t>Data:</w:t>
-      </w:r>
-      <w:r>
-        <w:t xml:space="preserve"> EmpatheticDialogues is English, crowd-sourced and single-labelled, so neither the detection accuracy nor the suitability of the replies can be assumed to carry over to Bangla speakers or to people in real distress. </w:t>
-      </w:r>
-      <w:r>
-        <w:rPr>
-          <w:b/>
-        </w:rPr>
-        <w:t>Safety:</w:t>
-      </w:r>
-      <w:r>
-        <w:t xml:space="preserve"> the label set has no category for suicidal ideation and the system has no crisis safeguard beyond interface disclaimers. </w:t>
-      </w:r>
-      <w:r>
-        <w:rPr>
-          <w:b/>
-        </w:rPr>
-        <w:t>Measures:</w:t>
-      </w:r>
-      <w:r>
-        <w:t xml:space="preserve"> all the automatic measures are proxies; the acknowledgement check is keyword-based, the one-question rule is not rewarded by either empathy measure, the classifier was trained on a different domain and rewards length, emotion fidelity depends on our own detector, and the judge panel has only two members. </w:t>
-      </w:r>
-      <w:r>
-        <w:rPr>
-          <w:b/>
-        </w:rPr>
-        <w:t>Scale of evidence:</w:t>
-      </w:r>
-      <w:r>
-        <w:t xml:space="preserve"> 300 conversations for generation, 64 for the judges, and a small human study </w:t>
-      </w:r>
-      <w:r>
-        <w:rPr>
-          <w:b/>
-          <w:color w:val="B03A00"/>
-        </w:rPr>
-        <w:t>[[PENDING: final number of participants]]</w:t>
-      </w:r>
-      <w:r>
-        <w:t xml:space="preserve">. </w:t>
-      </w:r>
-      <w:r>
-        <w:rPr>
-          <w:b/>
-        </w:rPr>
-        <w:t>Single turns:</w:t>
-      </w:r>
-      <w:r>
-        <w:t xml:space="preserve"> the quantitative results all concern first replies; the multi-turn agent was checked only on scenarios. </w:t>
-      </w:r>
-      <w:r>
-        <w:rPr>
-          <w:b/>
-        </w:rPr>
-        <w:t>Repetition:</w:t>
-      </w:r>
-      <w:r>
-        <w:t xml:space="preserve"> 58.7% of replies still reuse stock phrases. </w:t>
-      </w:r>
-      <w:r>
-        <w:rPr>
-          <w:b/>
-        </w:rPr>
-        <w:t>Efficiency:</w:t>
-      </w:r>
-      <w:r>
-        <w:t xml:space="preserve"> memory and time were measured on one GPU over 50 messages.</w:t>
-      </w:r>
-    </w:p>
-    <w:p>
-      <w:pPr>
-        <w:pStyle w:val="Heading2"/>
-      </w:pPr>
-      <w:r>
-        <w:t>5.6.6 Future Work</w:t>
-      </w:r>
-    </w:p>
-    <w:p>
-      <w:pPr>
-        <w:spacing w:after="120"/>
-      </w:pPr>
-      <w:r>
-        <w:t>In order of priority: add a pre-generation crisis filter with reviewed safe responses, which is required before any public deployment [52]; run a component-wise ablation that separates emotion selection, per-emotion guidance and attention cues; and combine the detector and per-emotion prompting with a larger generator.</w:t>
-      </w:r>
-    </w:p>
-    <w:p>
-      <w:pPr>
-        <w:spacing w:after="120"/>
-      </w:pPr>
-      <w:r>
-        <w:rPr>
-          <w:b/>
-        </w:rPr>
-        <w:t>Beyond English:</w:t>
-      </w:r>
-      <w:r>
-        <w:t xml:space="preserve"> Everything here is English, because the corpus is English and both models were pre-trained mostly on English text, so none of it should be assumed to hold for someone writing in another language. Extending the work is the next substantial piece, in three steps: collect or adapt labelled emotional conversations in Bangla, including the code-mixed Bangla-English people here actually type; retrain the detector from a multilingual encoder, which is cheap because only 125 million parameters sit behind it; and rewrite the per-emotion guidance with speakers of the language, since how loneliness or shame should be answered is not the same everywhere and a translated prompt would carry English assumptions with it. The decoupled structure helps: a new language needs a new detector and new guidance, not a new generator.</w:t>
-      </w:r>
-    </w:p>
-    <w:p>
-      <w:pPr>
-        <w:spacing w:after="120"/>
-      </w:pPr>
-      <w:r>
-        <w:t>After that: control repetition at decoding time; evaluate on real multi-turn conversations and with mental-health professionals; and measure memory and response time on other hardware, including CPU-only and mobile devices.</w:t>
+        <w:t>After that: control repetition at decoding time; evaluate on real multi-turn conversations; and measure memory and response time on other hardware, including CPU-only and mobile devices.</w:t>
       </w:r>
     </w:p>
     <w:p>

</xml_diff>

<commit_message>
Explain the two published detector results that beat ours
Section 5.5.1 already gave four reasons our detector is ahead of the
joint models, but said nothing about the two rows of Table 5.28 that are
above it, which is the first thing a reader checking the table will ask.

Welivita and Pu's 65.9% is measured on the situation description, a
difference our own data puts at about nine points. Chirpy Cardinal's
61.5% reads the same input we do, so it is decomposed with our own
measurements: 2.7 points of it is RoBERTa-large over RoBERTa-base, and
2.2 points is their validation split against our test split. Like for
like that leaves 55.2% against 61.5%, and the remaining six points are
reported as unexplained rather than argued away.

The section now states plainly that we do not claim the best published
accuracy on this corpus.

Co-Authored-By: Claude Opus 5 (1M context) <noreply@anthropic.com>
</commit_message>
<xml_diff>
--- a/final writing/Chapter_5_Results_and_Analysis.docx
+++ b/final writing/Chapter_5_Results_and_Analysis.docx
@@ -5563,6 +5563,14 @@
       </w:r>
       <w:r>
         <w:t>, one message rather than a whole conversation, which is what a live system actually has.</w:t>
+      </w:r>
+    </w:p>
+    <w:p>
+      <w:pPr>
+        <w:spacing w:after="120"/>
+      </w:pPr>
+      <w:r>
+        <w:t>Two entries in the table sit above our detector, and both are explained rather than omitted. Welivita and Pu report 65.9% [32], but on the situation description instead of the user's message, and Section 5.3.1 measures that difference on our own data at about nine points in favour of the description. The harder case is Chirpy Cardinal, whose RoBERTa classifier reaches 61.5% reading the first utterance, exactly as ours does [45]. Our own measurements account for part of that 11.2-point gap and not for all of it. Moving from RoBERTa-base to RoBERTa-large is worth 2.7 points on our test split, 50.3% to 53.0%; and their figure is on the validation split, which for our own RoBERTa-large is 2.2 points easier than test, 55.2% against 53.0%. Compared like for like, RoBERTa-large on validation, the two numbers are 55.2% and 61.5%, and the remaining six points are not explained by anything we can measure: the figure comes from an appendix of an Alexa Prize technical report that does not give the training protocol. We report the gap rather than explain it away, and we do not claim the best published accuracy on this corpus.</w:t>
       </w:r>
     </w:p>
     <w:tbl>

</xml_diff>